<commit_message>
Add: - Hoàn thành General và Specific của UC03
</commit_message>
<xml_diff>
--- a/specs/UC02-Explore-map/UC02.docx
+++ b/specs/UC02-Explore-map/UC02.docx
@@ -1189,18 +1189,7 @@
                 <w:szCs w:val="28"/>
                 <w:lang w:val="en-US"/>
               </w:rPr>
-              <w:t>A1:</w:t>
-            </w:r>
-            <w:r>
-              <w:rPr>
-                <w:rFonts w:asciiTheme="majorHAnsi" w:hAnsiTheme="majorHAnsi" w:cstheme="majorHAnsi"/>
-                <w:b/>
-                <w:bCs/>
-                <w:sz w:val="28"/>
-                <w:szCs w:val="28"/>
-                <w:lang w:val="en-US"/>
-              </w:rPr>
-              <w:t xml:space="preserve"> </w:t>
+              <w:t xml:space="preserve">A1: </w:t>
             </w:r>
             <w:r>
               <w:rPr>
@@ -1536,6 +1525,7 @@
         <w:tc>
           <w:tcPr>
             <w:tcW w:w="3005" w:type="dxa"/>
+            <w:vMerge/>
           </w:tcPr>
           <w:p>
             <w:pPr>
@@ -1592,6 +1582,7 @@
         <w:tc>
           <w:tcPr>
             <w:tcW w:w="3005" w:type="dxa"/>
+            <w:vMerge/>
           </w:tcPr>
           <w:p>
             <w:pPr>
@@ -1660,6 +1651,7 @@
         <w:tc>
           <w:tcPr>
             <w:tcW w:w="3005" w:type="dxa"/>
+            <w:vMerge/>
           </w:tcPr>
           <w:p>
             <w:pPr>
@@ -1721,6 +1713,7 @@
         <w:tc>
           <w:tcPr>
             <w:tcW w:w="3005" w:type="dxa"/>
+            <w:vMerge/>
           </w:tcPr>
           <w:p>
             <w:pPr>
@@ -2674,6 +2667,7 @@
         <w:tc>
           <w:tcPr>
             <w:tcW w:w="3005" w:type="dxa"/>
+            <w:vMerge/>
           </w:tcPr>
           <w:p>
             <w:pPr>
@@ -3370,16 +3364,6 @@
                 <w:szCs w:val="28"/>
               </w:rPr>
             </w:pPr>
-            <w:r>
-              <w:rPr>
-                <w:rFonts w:asciiTheme="majorHAnsi" w:hAnsiTheme="majorHAnsi" w:cstheme="majorHAnsi"/>
-                <w:b/>
-                <w:bCs/>
-                <w:sz w:val="28"/>
-                <w:szCs w:val="28"/>
-              </w:rPr>
-              <w:t>T</w:t>
-            </w:r>
             <w:r>
               <w:rPr>
                 <w:rFonts w:asciiTheme="majorHAnsi" w:hAnsiTheme="majorHAnsi" w:cstheme="majorHAnsi"/>
@@ -5579,6 +5563,7 @@
   <w:style w:type="character" w:default="1" w:styleId="DefaultParagraphFont">
     <w:name w:val="Default Paragraph Font"/>
     <w:uiPriority w:val="1"/>
+    <w:semiHidden/>
     <w:unhideWhenUsed/>
   </w:style>
   <w:style w:type="table" w:default="1" w:styleId="TableNormal">

</xml_diff>